<commit_message>
chore: 행감 자료 자동 갱신 2026-09-28
</commit_message>
<xml_diff>
--- a/문서/2026_행감_질의서_전체.docx
+++ b/문서/2026_행감_질의서_전체.docx
@@ -44,7 +44,7 @@
           <w:color w:val="6B7280"/>
           <w:sz w:val="20"/>
         </w:rPr>
-        <w:t>문화체육관광국 및 산하기관 · 작성 2026. 09. 23. · 자료 기준 2026-09-23</w:t>
+        <w:t>문화체육관광국 및 산하기관 · 작성 2026. 09. 28. · 자료 기준 2026-09-28</w:t>
       </w:r>
     </w:p>
     <w:p>
@@ -1264,6 +1264,34 @@
           <w:b w:val="0"/>
           <w:sz w:val="20"/>
         </w:rPr>
+        <w:t>· (전국(대한체육회)) 이기흥 전 대한체육회장 부정채용·횡령 등 의혹, 경찰 수사 1년10개월 만에 증거불충분·공소시효로 불송치(2026.9.21) — 체육회 자체는 앞서 자격정지 4년 결정. 비위 처리에 오랜 시간이 걸리는 사례.</w:t>
+      </w:r>
+    </w:p>
+    <w:p>
+      <w:pPr>
+        <w:spacing w:after="0" w:before="0" w:line="324" w:lineRule="auto"/>
+        <w:ind w:left="283"/>
+      </w:pPr>
+      <w:r>
+        <w:rPr>
+          <w:rFonts w:ascii="맑은 고딕" w:hAnsi="맑은 고딕" w:eastAsia="맑은 고딕"/>
+          <w:b w:val="0"/>
+          <w:sz w:val="20"/>
+        </w:rPr>
+        <w:t>· (충남) 데플림픽 메달리스트 선수 유가족이 충남장애인체육회 상벌위 결정에 반발(2026.9.23) — 상벌위 운영의 공정성·투명성 논란.</w:t>
+      </w:r>
+    </w:p>
+    <w:p>
+      <w:pPr>
+        <w:spacing w:after="0" w:before="0" w:line="324" w:lineRule="auto"/>
+        <w:ind w:left="283"/>
+      </w:pPr>
+      <w:r>
+        <w:rPr>
+          <w:rFonts w:ascii="맑은 고딕" w:hAnsi="맑은 고딕" w:eastAsia="맑은 고딕"/>
+          <w:b w:val="0"/>
+          <w:sz w:val="20"/>
+        </w:rPr>
         <w:t>· (경기도) 경기도체육회 격투대회 중상자 발생에도 ‘사고 없음’ 기록 의혹(8월), 선수단 관리·감독 시정요구 추진 중.</w:t>
       </w:r>
     </w:p>
@@ -1293,7 +1321,7 @@
           <w:color w:val="6B7280"/>
           <w:sz w:val="17"/>
         </w:rPr>
-        <w:t>출처: 세계일보 2026.9.17 https://www.segye.com/newsView/20260917516880 / 서울Pn 2026.9.7 https://go.seoul.co.kr/news/newsView.php?id=20260907500027 / 인천일보 https://www.incheonilbo.com/news/articleView.html?idxno=1330440 / kyongbuk.co.kr 2026.9.16 https://news.google.com/rss/articles/CBMib0FVX3lxTE5mVFQ0NHB0VTJRaFhqZG1obkFlRFBjTVluQ185LXNiRXZkaGlWTk9oTy1IY3VHcUxubUVKVlJDWFVPdVFNWVRKYnh6c01CNXlGRHMwTEkwUXRPQ2w5NW9kcV8wekd6Y1JqbFM4c3poWQ?oc=5 / gukjenews.com 2026.9.16 https://news.google.com/rss/articles/CBMibkFVX3lxTE5PX0x4cHF5N0dQTEc0Wm5JcXg0NTdtTXoxWTdWeV9ZM041N0pMUGM4b0FvVmtMYnJPY0x1ZEhMMXljOElndmJEeVV2Q0JmcHBldDBpSmZlaXBrdHI5bFI3TTFSX19YUkprNFIzNE53?oc=5</w:t>
+        <w:t>출처: 세계일보 2026.9.17 https://www.segye.com/newsView/20260917516880 / 서울Pn 2026.9.7 https://go.seoul.co.kr/news/newsView.php?id=20260907500027 / 인천일보 https://www.incheonilbo.com/news/articleView.html?idxno=1330440 / kyongbuk.co.kr 2026.9.16 https://news.google.com/rss/articles/CBMib0FVX3lxTE5mVFQ0NHB0VTJRaFhqZG1obkFlRFBjTVluQ185LXNiRXZkaGlWTk9oTy1IY3VHcUxubUVKVlJDWFVPdVFNWVRKYnh6c01CNXlGRHMwTEkwUXRPQ2w5NW9kcV8wekd6Y1JqbFM4c3poWQ?oc=5 / gukjenews.com 2026.9.16 https://news.google.com/rss/articles/CBMibkFVX3lxTE5PX0x4cHF5N0dQTEc0Wm5JcXg0NTdtTXoxWTdWeV9ZM041N0pMUGM4b0FvVmtMYnJPY0x1ZEhMMXljOElndmJEeVV2Q0JmcHBldDBpSmZlaXBrdHI5bFI3TTFSX19YUkprNFIzNE53?oc=5 / 더팩트 2026.9.21 https://news.google.com/rss/articles/CBMiVkFVX3lxTFA4UF9PMXduWTQyZGVtbHNLZGRFdnRoMER4NkdqNkVZaDlMbW5qSXBiUFg3NGtkNEZOa1ZNdjVGWFVPMm1YWF9PRHJzZFJNMHJnNngzbmRB0gFQQVVfeXFMUEJVSVp2bzBYSFdzejBXTFlEU0lSWTRLb3FuS3VSa0M5QjR4MWJ1U0RJNjlrQlJWNHc1QlJEbXA1UWlnRzg2ZFdRVE96WWhjX0w?oc=5 / 에이블뉴스 2026.9.23 https://news.google.com/rss/articles/CBMibkFVX3lxTE00UHFCT0dXQ3lIVHNDVUl2YUdxcXBGWUgyTkRrTlJ0dC1DeDV0Y1BMZzZ3anl4TUU4UmVocng1S05kUWpySlFRUjVDRjFoZGlhQUI3allEXzUxM19ja0JYaGZnd0ZHSHlnVWZPOVZn0gFyQVVfeXFMTmFWdFZ6SWRfanJ2NFZwNjFfUHpySjA4TUhuWmtqRjBCVzRLc1prX2Fjb3gtOWx0elExcHI4VkZPM0FfYl9HakNmWjNOUDg0NkNoeDFSNnhucW9nN0ZJUW10YzVVNWltRU1DSFlkRUNoRW9B?oc=5</w:t>
       </w:r>
     </w:p>
     <w:p>
@@ -1821,6 +1849,176 @@
       </w:r>
     </w:p>
     <w:p>
+      <w:pPr>
+        <w:spacing w:after="20" w:before="80" w:line="324" w:lineRule="auto"/>
+      </w:pPr>
+      <w:r>
+        <w:rPr>
+          <w:rFonts w:ascii="맑은 고딕" w:hAnsi="맑은 고딕" w:eastAsia="맑은 고딕"/>
+          <w:b/>
+          <w:color w:val="185FA5"/>
+          <w:sz w:val="22"/>
+        </w:rPr>
+        <w:t>[B14] 게임 제작비 세액공제 사각지대 — 영상·웹툰은 대상, 게임은 제외</w:t>
+      </w:r>
+    </w:p>
+    <w:p>
+      <w:pPr>
+        <w:spacing w:after="0" w:before="0" w:line="324" w:lineRule="auto"/>
+        <w:ind w:left="283"/>
+      </w:pPr>
+      <w:r>
+        <w:rPr>
+          <w:rFonts w:ascii="맑은 고딕" w:hAnsi="맑은 고딕" w:eastAsia="맑은 고딕"/>
+          <w:b w:val="0"/>
+          <w:sz w:val="20"/>
+        </w:rPr>
+        <w:t>· (정부) 조세특례제한법상 영화·방송·OTT·웹툰 제작비는 세액공제 대상이나 게임 제작비는 별도 공제 규정 없음. 정부는 R&amp;D세액공제로 대체 가능하다는 입장이나, 한국콘텐츠진흥원 조사 결과 게임 제작·배급업체 1,398곳 중 R&amp;D세액공제 실제 이용 2.1%, 통합투자세액공제 이용 0.1%에 불과.</w:t>
+      </w:r>
+    </w:p>
+    <w:p>
+      <w:pPr>
+        <w:spacing w:after="0" w:before="0" w:line="324" w:lineRule="auto"/>
+        <w:ind w:left="283"/>
+      </w:pPr>
+      <w:r>
+        <w:rPr>
+          <w:rFonts w:ascii="맑은 고딕" w:hAnsi="맑은 고딕" w:eastAsia="맑은 고딕"/>
+          <w:b w:val="0"/>
+          <w:sz w:val="20"/>
+        </w:rPr>
+        <w:t>· (경기도) 경기콘텐츠진흥원이 게임·e스포츠·XR 사업을 미래성장산업국 보조금(76.6억)으로 운영(d-contents-3 게임 이원화 이슈와 연결). 세제 사각지대에 대한 도 차원 보완책은 별도 확인 필요.</w:t>
+      </w:r>
+    </w:p>
+    <w:p>
+      <w:pPr>
+        <w:spacing w:after="0" w:before="0" w:line="324" w:lineRule="auto"/>
+        <w:ind w:left="283"/>
+      </w:pPr>
+      <w:r>
+        <w:rPr>
+          <w:rFonts w:ascii="맑은 고딕" w:hAnsi="맑은 고딕" w:eastAsia="맑은 고딕"/>
+          <w:b/>
+          <w:sz w:val="20"/>
+        </w:rPr>
+        <w:t>▶ 시사점: 국비 세제지원에서 게임산업만 빠진 상황에서, 도가 경기게임아카데미 등으로 부분 보완하고 있는지, 정부 제도개선 건의 계획이 있는지 확인할 수 있다.</w:t>
+      </w:r>
+    </w:p>
+    <w:p>
+      <w:pPr>
+        <w:spacing w:after="60" w:before="0" w:line="324" w:lineRule="auto"/>
+        <w:ind w:left="283"/>
+      </w:pPr>
+      <w:r>
+        <w:rPr>
+          <w:rFonts w:ascii="맑은 고딕" w:hAnsi="맑은 고딕" w:eastAsia="맑은 고딕"/>
+          <w:b w:val="0"/>
+          <w:color w:val="6B7280"/>
+          <w:sz w:val="17"/>
+        </w:rPr>
+        <w:t>출처: 쿠키뉴스 2026.9.28 https://news.google.com/rss/articles/CBMiY0FVX3lxTE04ZUJGekNvU3FOMVJVMTNEeDBwZnRFNGV1THVZMW5TUV9YOGo4VFR3RWdzN1RDcHVVd1N4T2tYZWxjVWVnejdGb1RyRHVOSm9FN01wVEJtR0Y0MzNNa2N0eUNMdw?oc=5</w:t>
+      </w:r>
+    </w:p>
+    <w:p>
+      <w:pPr>
+        <w:spacing w:after="20" w:before="80" w:line="324" w:lineRule="auto"/>
+      </w:pPr>
+      <w:r>
+        <w:rPr>
+          <w:rFonts w:ascii="맑은 고딕" w:hAnsi="맑은 고딕" w:eastAsia="맑은 고딕"/>
+          <w:b/>
+          <w:color w:val="185FA5"/>
+          <w:sz w:val="22"/>
+        </w:rPr>
+        <w:t>[B15] 학교운동부 감소 — 경기도 66곳 폐부, 전국 최다권역</w:t>
+      </w:r>
+    </w:p>
+    <w:p>
+      <w:pPr>
+        <w:spacing w:after="0" w:before="0" w:line="324" w:lineRule="auto"/>
+        <w:ind w:left="283"/>
+      </w:pPr>
+      <w:r>
+        <w:rPr>
+          <w:rFonts w:ascii="맑은 고딕" w:hAnsi="맑은 고딕" w:eastAsia="맑은 고딕"/>
+          <w:b w:val="0"/>
+          <w:sz w:val="20"/>
+        </w:rPr>
+        <w:t>· (정부) 국회 문체위 자료: 최근 3년(2023~2025) 전국 학교운동부 신설 124곳 vs 폐부 233곳 — 1곳 창단 동안 2곳 가까이 폐부. 원인: 학교 안전관리 책임, 인건비·운영비 부담, 학생 수 감소에 따른 선수 수급난, 코로나19 영향.</w:t>
+      </w:r>
+    </w:p>
+    <w:p>
+      <w:pPr>
+        <w:spacing w:after="0" w:before="0" w:line="324" w:lineRule="auto"/>
+        <w:ind w:left="283"/>
+      </w:pPr>
+      <w:r>
+        <w:rPr>
+          <w:rFonts w:ascii="맑은 고딕" w:hAnsi="맑은 고딕" w:eastAsia="맑은 고딕"/>
+          <w:b w:val="0"/>
+          <w:sz w:val="20"/>
+        </w:rPr>
+        <w:t>· (서울) 5곳 신설·33곳 폐부</w:t>
+      </w:r>
+    </w:p>
+    <w:p>
+      <w:pPr>
+        <w:spacing w:after="0" w:before="0" w:line="324" w:lineRule="auto"/>
+        <w:ind w:left="283"/>
+      </w:pPr>
+      <w:r>
+        <w:rPr>
+          <w:rFonts w:ascii="맑은 고딕" w:hAnsi="맑은 고딕" w:eastAsia="맑은 고딕"/>
+          <w:b w:val="0"/>
+          <w:sz w:val="20"/>
+        </w:rPr>
+        <w:t>· (경남·제주) 경남 7곳, 제주 4곳 순증(전국 추세와 반대)</w:t>
+      </w:r>
+    </w:p>
+    <w:p>
+      <w:pPr>
+        <w:spacing w:after="0" w:before="0" w:line="324" w:lineRule="auto"/>
+        <w:ind w:left="283"/>
+      </w:pPr>
+      <w:r>
+        <w:rPr>
+          <w:rFonts w:ascii="맑은 고딕" w:hAnsi="맑은 고딕" w:eastAsia="맑은 고딕"/>
+          <w:b w:val="0"/>
+          <w:sz w:val="20"/>
+        </w:rPr>
+        <w:t>· (경기도) 경기도 9곳 신설·66곳 폐부 — 경기·서울 두 지역이 전국 폐부의 42.5%를 차지, 수도권 감소가 가장 심각.</w:t>
+      </w:r>
+    </w:p>
+    <w:p>
+      <w:pPr>
+        <w:spacing w:after="0" w:before="0" w:line="324" w:lineRule="auto"/>
+        <w:ind w:left="283"/>
+      </w:pPr>
+      <w:r>
+        <w:rPr>
+          <w:rFonts w:ascii="맑은 고딕" w:hAnsi="맑은 고딕" w:eastAsia="맑은 고딕"/>
+          <w:b/>
+          <w:sz w:val="20"/>
+        </w:rPr>
+        <w:t>▶ 시사점: 경기도가 전국에서 학교운동부 감소가 가장 심각한 지역으로 나타났다. 도교육청과의 협력 체계, 직장운동경기부·실업팀 연계, 감소 추세에 대한 도 차원 대응 계획을 확인해야 한다.</w:t>
+      </w:r>
+    </w:p>
+    <w:p>
+      <w:pPr>
+        <w:spacing w:after="60" w:before="0" w:line="324" w:lineRule="auto"/>
+        <w:ind w:left="283"/>
+      </w:pPr>
+      <w:r>
+        <w:rPr>
+          <w:rFonts w:ascii="맑은 고딕" w:hAnsi="맑은 고딕" w:eastAsia="맑은 고딕"/>
+          <w:b w:val="0"/>
+          <w:color w:val="6B7280"/>
+          <w:sz w:val="17"/>
+        </w:rPr>
+        <w:t>출처: 다음뉴스 2026.9.23 https://news.google.com/rss/articles/CBMiVEFVX3lxTFByUkhaNk9tajdRX0FsQzF1UkJNOFROUjJueUpYdFdaRzdqMkQ2OTlvdU83UE16X2dsSWNEcUUxQ25tdVdmYnFxWm1rMHpsaW5RczdBRg?oc=5</w:t>
+      </w:r>
+    </w:p>
+    <w:p>
       <w:r>
         <w:br w:type="page"/>
       </w:r>
@@ -5303,6 +5501,62 @@
     </w:p>
     <w:p>
       <w:pPr>
+        <w:spacing w:after="20" w:before="0" w:line="324" w:lineRule="auto"/>
+        <w:ind w:left="113"/>
+      </w:pPr>
+      <w:r>
+        <w:rPr>
+          <w:rFonts w:ascii="맑은 고딕" w:hAnsi="맑은 고딕" w:eastAsia="맑은 고딕"/>
+          <w:b/>
+          <w:sz w:val="21"/>
+        </w:rPr>
+        <w:t xml:space="preserve">6. </w:t>
+      </w:r>
+      <w:r>
+        <w:rPr>
+          <w:rFonts w:ascii="맑은 고딕" w:hAnsi="맑은 고딕" w:eastAsia="맑은 고딕"/>
+          <w:b/>
+          <w:sz w:val="21"/>
+        </w:rPr>
+        <w:t>예술활동증명 처리 지연이 도 예술인 기회소득 심사에 미치는 영향</w:t>
+      </w:r>
+    </w:p>
+    <w:p>
+      <w:pPr>
+        <w:spacing w:after="20" w:before="0" w:line="324" w:lineRule="auto"/>
+        <w:ind w:left="454"/>
+      </w:pPr>
+      <w:r>
+        <w:rPr>
+          <w:rFonts w:ascii="맑은 고딕" w:hAnsi="맑은 고딕" w:eastAsia="맑은 고딕"/>
+          <w:b w:val="0"/>
+          <w:sz w:val="21"/>
+        </w:rPr>
+        <w:t>한국예술인복지재단의 예술활동증명 담당 인력이 5명뿐이라 올해 신청 17만 건 처리가 크게 지연되고 있다는 지적이 나왔습니다(국회 문체위 이정문 의원). 경기도 예술인 기회소득 신청자 중 이 증명 발급 지연으로 심사·지급이 늦어진 사례가 있습니까? 있다면 도 차원의 대응 방안은 무엇입니까?</w:t>
+      </w:r>
+    </w:p>
+    <w:p>
+      <w:pPr>
+        <w:spacing w:after="0" w:before="0" w:line="324" w:lineRule="auto"/>
+        <w:ind w:left="454"/>
+      </w:pPr>
+      <w:r>
+        <w:rPr>
+          <w:rFonts w:ascii="맑은 고딕" w:hAnsi="맑은 고딕" w:eastAsia="맑은 고딕"/>
+          <w:b w:val="0"/>
+          <w:color w:val="6B7280"/>
+          <w:sz w:val="19"/>
+        </w:rPr>
+        <w:t>· 배경: 국회 문체위 이정문 의원실 자료, 연합뉴스 2026.9.23.</w:t>
+      </w:r>
+    </w:p>
+    <w:p>
+      <w:pPr>
+        <w:spacing w:after="60" w:before="0" w:line="324" w:lineRule="auto"/>
+      </w:pPr>
+    </w:p>
+    <w:p>
+      <w:pPr>
         <w:spacing w:after="40" w:before="0" w:line="324" w:lineRule="auto"/>
       </w:pPr>
       <w:r>
@@ -5992,6 +6246,119 @@
     </w:p>
     <w:p>
       <w:pPr>
+        <w:spacing w:after="20" w:before="0" w:line="324" w:lineRule="auto"/>
+        <w:ind w:left="113"/>
+      </w:pPr>
+      <w:r>
+        <w:rPr>
+          <w:rFonts w:ascii="맑은 고딕" w:hAnsi="맑은 고딕" w:eastAsia="맑은 고딕"/>
+          <w:b/>
+          <w:color w:val="B91C1C"/>
+          <w:sz w:val="21"/>
+        </w:rPr>
+        <w:t xml:space="preserve">7. 【중점】 </w:t>
+      </w:r>
+      <w:r>
+        <w:rPr>
+          <w:rFonts w:ascii="맑은 고딕" w:hAnsi="맑은 고딕" w:eastAsia="맑은 고딕"/>
+          <w:b/>
+          <w:sz w:val="21"/>
+        </w:rPr>
+        <w:t>학교운동부 감소 실태(경기도 66곳 폐부)</w:t>
+      </w:r>
+    </w:p>
+    <w:p>
+      <w:pPr>
+        <w:spacing w:after="20" w:before="0" w:line="324" w:lineRule="auto"/>
+        <w:ind w:left="454"/>
+      </w:pPr>
+      <w:r>
+        <w:rPr>
+          <w:rFonts w:ascii="맑은 고딕" w:hAnsi="맑은 고딕" w:eastAsia="맑은 고딕"/>
+          <w:b w:val="0"/>
+          <w:sz w:val="21"/>
+        </w:rPr>
+        <w:t>국회 문체위 자료에 따르면 최근 3년(2023~2025) 경기도 내 학교운동부는 9곳이 신설되는 동안 66곳이 폐부돼, 서울(5곳 신설·33곳 폐부)과 함께 전국 폐부의 42.5%를 차지했습니다. 폐부 사유(안전관리 부담·인건비·선수 수급난)를 도 차원에서 파악하고 있습니까? 도교육청과 협력한 학교운동부 존치·통합 지원 대책이나 직장운동경기부·실업팀 연계 방안이 있습니까?</w:t>
+      </w:r>
+    </w:p>
+    <w:p>
+      <w:pPr>
+        <w:spacing w:after="0" w:before="0" w:line="324" w:lineRule="auto"/>
+        <w:ind w:left="454"/>
+      </w:pPr>
+      <w:r>
+        <w:rPr>
+          <w:rFonts w:ascii="맑은 고딕" w:hAnsi="맑은 고딕" w:eastAsia="맑은 고딕"/>
+          <w:b w:val="0"/>
+          <w:color w:val="6B7280"/>
+          <w:sz w:val="19"/>
+        </w:rPr>
+        <w:t>· 배경: 국회 문체위 자료, 다음뉴스 2026.9.23 단독보도.</w:t>
+      </w:r>
+    </w:p>
+    <w:p>
+      <w:pPr>
+        <w:spacing w:after="60" w:before="0" w:line="324" w:lineRule="auto"/>
+      </w:pPr>
+    </w:p>
+    <w:p>
+      <w:pPr>
+        <w:spacing w:after="20" w:before="0" w:line="324" w:lineRule="auto"/>
+        <w:ind w:left="113"/>
+      </w:pPr>
+      <w:r>
+        <w:rPr>
+          <w:rFonts w:ascii="맑은 고딕" w:hAnsi="맑은 고딕" w:eastAsia="맑은 고딕"/>
+          <w:b/>
+          <w:sz w:val="21"/>
+        </w:rPr>
+        <w:t xml:space="preserve">8. </w:t>
+      </w:r>
+      <w:r>
+        <w:rPr>
+          <w:rFonts w:ascii="맑은 고딕" w:hAnsi="맑은 고딕" w:eastAsia="맑은 고딕"/>
+          <w:b/>
+          <w:sz w:val="21"/>
+        </w:rPr>
+        <w:t>은퇴선수 진로지원 실효성</w:t>
+      </w:r>
+    </w:p>
+    <w:p>
+      <w:pPr>
+        <w:spacing w:after="20" w:before="0" w:line="324" w:lineRule="auto"/>
+        <w:ind w:left="454"/>
+      </w:pPr>
+      <w:r>
+        <w:rPr>
+          <w:rFonts w:ascii="맑은 고딕" w:hAnsi="맑은 고딕" w:eastAsia="맑은 고딕"/>
+          <w:b w:val="0"/>
+          <w:sz w:val="21"/>
+        </w:rPr>
+        <w:t>최근 5년간 전국 은퇴선수(선수경력자) 4만437명 중 정부 지원사업으로 취·창업한 인원은 202명(연 1% 미만)에 그쳤고, 정부가 발표하는 '진로전환율'은 전체가 아닌 진로지원센터 등록자만을 기준으로 산정해 실제와 괴리가 있다는 지적이 나왔습니다(임오경 의원). 경기도 소속 직장운동경기부 등에서 계약 만료·은퇴한 선수의 진로지원 실적과 국민체육진흥공단 '체육인 직업안정 사업' 연계·안내 현황은 어떻습니까?</w:t>
+      </w:r>
+    </w:p>
+    <w:p>
+      <w:pPr>
+        <w:spacing w:after="0" w:before="0" w:line="324" w:lineRule="auto"/>
+        <w:ind w:left="454"/>
+      </w:pPr>
+      <w:r>
+        <w:rPr>
+          <w:rFonts w:ascii="맑은 고딕" w:hAnsi="맑은 고딕" w:eastAsia="맑은 고딕"/>
+          <w:b w:val="0"/>
+          <w:color w:val="6B7280"/>
+          <w:sz w:val="19"/>
+        </w:rPr>
+        <w:t>· 배경: 국회 문체위 임오경 의원실 자료, 쿠키뉴스 2026.9.25.</w:t>
+      </w:r>
+    </w:p>
+    <w:p>
+      <w:pPr>
+        <w:spacing w:after="60" w:before="0" w:line="324" w:lineRule="auto"/>
+      </w:pPr>
+    </w:p>
+    <w:p>
+      <w:pPr>
         <w:spacing w:after="40" w:before="0" w:line="324" w:lineRule="auto"/>
       </w:pPr>
       <w:r>
@@ -9992,6 +10359,62 @@
     </w:p>
     <w:p>
       <w:pPr>
+        <w:spacing w:after="20" w:before="0" w:line="324" w:lineRule="auto"/>
+        <w:ind w:left="113"/>
+      </w:pPr>
+      <w:r>
+        <w:rPr>
+          <w:rFonts w:ascii="맑은 고딕" w:hAnsi="맑은 고딕" w:eastAsia="맑은 고딕"/>
+          <w:b/>
+          <w:sz w:val="21"/>
+        </w:rPr>
+        <w:t xml:space="preserve">7. </w:t>
+      </w:r>
+      <w:r>
+        <w:rPr>
+          <w:rFonts w:ascii="맑은 고딕" w:hAnsi="맑은 고딕" w:eastAsia="맑은 고딕"/>
+          <w:b/>
+          <w:sz w:val="21"/>
+        </w:rPr>
+        <w:t>게임 제작비 세액공제 사각지대</w:t>
+      </w:r>
+    </w:p>
+    <w:p>
+      <w:pPr>
+        <w:spacing w:after="20" w:before="0" w:line="324" w:lineRule="auto"/>
+        <w:ind w:left="454"/>
+      </w:pPr>
+      <w:r>
+        <w:rPr>
+          <w:rFonts w:ascii="맑은 고딕" w:hAnsi="맑은 고딕" w:eastAsia="맑은 고딕"/>
+          <w:b w:val="0"/>
+          <w:sz w:val="21"/>
+        </w:rPr>
+        <w:t>영화·방송·웹툰은 제작비 세액공제를 받지만 게임은 현행 조세특례제한법상 별도 제작비 공제 대상이 아니며, 정부가 근거로 제시하는 R&amp;D 세액공제는 실제 이용 기업이 2.1%에 불과하다는 지적이 나왔습니다. 경콘진이 지원하는 도내 게임업체 중 이 세제 사각지대의 영향을 파악하고 있습니까? 경기게임아카데미 등 도 차원 지원사업으로 어느 정도 보완되고 있으며, 정부에 제도 개선을 건의할 계획이 있습니까?</w:t>
+      </w:r>
+    </w:p>
+    <w:p>
+      <w:pPr>
+        <w:spacing w:after="0" w:before="0" w:line="324" w:lineRule="auto"/>
+        <w:ind w:left="454"/>
+      </w:pPr>
+      <w:r>
+        <w:rPr>
+          <w:rFonts w:ascii="맑은 고딕" w:hAnsi="맑은 고딕" w:eastAsia="맑은 고딕"/>
+          <w:b w:val="0"/>
+          <w:color w:val="6B7280"/>
+          <w:sz w:val="19"/>
+        </w:rPr>
+        <w:t>· 배경: 쿠키뉴스 2026.9.28, 한국게임산업협회·조승래 의원실 자료.</w:t>
+      </w:r>
+    </w:p>
+    <w:p>
+      <w:pPr>
+        <w:spacing w:after="60" w:before="0" w:line="324" w:lineRule="auto"/>
+      </w:pPr>
+    </w:p>
+    <w:p>
+      <w:pPr>
         <w:spacing w:after="40" w:before="0" w:line="324" w:lineRule="auto"/>
       </w:pPr>
       <w:r>
@@ -12308,6 +12731,63 @@
           <w:sz w:val="19"/>
         </w:rPr>
         <w:t>· 관련 자료요구: DMZ-1</w:t>
+      </w:r>
+    </w:p>
+    <w:p>
+      <w:pPr>
+        <w:spacing w:after="60" w:before="0" w:line="324" w:lineRule="auto"/>
+      </w:pPr>
+    </w:p>
+    <w:p>
+      <w:pPr>
+        <w:spacing w:after="20" w:before="0" w:line="324" w:lineRule="auto"/>
+        <w:ind w:left="113"/>
+      </w:pPr>
+      <w:r>
+        <w:rPr>
+          <w:rFonts w:ascii="맑은 고딕" w:hAnsi="맑은 고딕" w:eastAsia="맑은 고딕"/>
+          <w:b/>
+          <w:color w:val="B91C1C"/>
+          <w:sz w:val="21"/>
+        </w:rPr>
+        <w:t xml:space="preserve">4. 【중점】 </w:t>
+      </w:r>
+      <w:r>
+        <w:rPr>
+          <w:rFonts w:ascii="맑은 고딕" w:hAnsi="맑은 고딕" w:eastAsia="맑은 고딕"/>
+          <w:b/>
+          <w:sz w:val="21"/>
+        </w:rPr>
+        <w:t>관객 수 집계 기준·의결 전 감액안 적용 경위</w:t>
+      </w:r>
+    </w:p>
+    <w:p>
+      <w:pPr>
+        <w:spacing w:after="20" w:before="0" w:line="324" w:lineRule="auto"/>
+        <w:ind w:left="454"/>
+      </w:pPr>
+      <w:r>
+        <w:rPr>
+          <w:rFonts w:ascii="맑은 고딕" w:hAnsi="맑은 고딕" w:eastAsia="맑은 고딕"/>
+          <w:b w:val="0"/>
+          <w:sz w:val="21"/>
+        </w:rPr>
+        <w:t>도와 영화제 측이 밝힌 관객 수에 차이가 있어 감액 근거로 쓰인 '관객 1인당 투입 예산' 계산이 정확한지 의문이 제기됐습니다. 각각 어떤 기준·범위로 집계했습니까? 또한 의회가 의결하지 않은 감액안을 영화제 현장에 먼저 적용한 것은 누구의 결정이며 어떤 권한에 근거합니까? 출품 규정에 공표된 시상·사업을 변경하면서 계약·인력·용역 관계에 대한 법률 검토는 거쳤습니까?</w:t>
+      </w:r>
+    </w:p>
+    <w:p>
+      <w:pPr>
+        <w:spacing w:after="0" w:before="0" w:line="324" w:lineRule="auto"/>
+        <w:ind w:left="454"/>
+      </w:pPr>
+      <w:r>
+        <w:rPr>
+          <w:rFonts w:ascii="맑은 고딕" w:hAnsi="맑은 고딕" w:eastAsia="맑은 고딕"/>
+          <w:b w:val="0"/>
+          <w:color w:val="6B7280"/>
+          <w:sz w:val="19"/>
+        </w:rPr>
+        <w:t>· 배경: 최규진 의원(문체위) 문제제기, 전자신문 2026.9.26. 김민석 더불어민주당 대표 '계약 파기' 비판 → 추미애 지사 반박 논쟁 진행 중.</w:t>
       </w:r>
     </w:p>
     <w:p>

</xml_diff>